<commit_message>
Se realizan cambios menores
</commit_message>
<xml_diff>
--- a/Imagenes del antes y despues.docx
+++ b/Imagenes del antes y despues.docx
@@ -7,6 +7,9 @@
         <w:t>Imágenes de cómo se veía la página web antes de aplicar Bootstrap:</w:t>
       </w:r>
       <w:r>
+        <w:rPr>
+          <w:noProof/>
+        </w:rPr>
         <w:drawing>
           <wp:inline distT="0" distB="0" distL="0" distR="0" wp14:anchorId="258972E0" wp14:editId="5C5ED122">
             <wp:extent cx="5612130" cy="2705100"/>
@@ -46,6 +49,9 @@
     </w:p>
     <w:p>
       <w:r>
+        <w:rPr>
+          <w:noProof/>
+        </w:rPr>
         <w:drawing>
           <wp:inline distT="0" distB="0" distL="0" distR="0" wp14:anchorId="7347AE6B" wp14:editId="100BE4DD">
             <wp:extent cx="5612130" cy="2643505"/>
@@ -85,6 +91,9 @@
     </w:p>
     <w:p>
       <w:r>
+        <w:rPr>
+          <w:noProof/>
+        </w:rPr>
         <w:drawing>
           <wp:inline distT="0" distB="0" distL="0" distR="0" wp14:anchorId="5BF87C3F" wp14:editId="742EE799">
             <wp:extent cx="5612130" cy="2197100"/>
@@ -110,6 +119,90 @@
                     <a:xfrm>
                       <a:off x="0" y="0"/>
                       <a:ext cx="5612130" cy="2197100"/>
+                    </a:xfrm>
+                    <a:prstGeom prst="rect">
+                      <a:avLst/>
+                    </a:prstGeom>
+                  </pic:spPr>
+                </pic:pic>
+              </a:graphicData>
+            </a:graphic>
+          </wp:inline>
+        </w:drawing>
+      </w:r>
+    </w:p>
+    <w:p>
+      <w:r>
+        <w:lastRenderedPageBreak/>
+        <w:t>Imágenes de la página después de aplicar Bootstrap:</w:t>
+      </w:r>
+    </w:p>
+    <w:p>
+      <w:r>
+        <w:drawing>
+          <wp:inline distT="0" distB="0" distL="0" distR="0" wp14:anchorId="2D1B63E4" wp14:editId="5655792A">
+            <wp:extent cx="5612130" cy="2680970"/>
+            <wp:effectExtent l="0" t="0" r="7620" b="5080"/>
+            <wp:docPr id="365445664" name="Imagen 1"/>
+            <wp:cNvGraphicFramePr>
+              <a:graphicFrameLocks xmlns:a="http://schemas.openxmlformats.org/drawingml/2006/main" noChangeAspect="1"/>
+            </wp:cNvGraphicFramePr>
+            <a:graphic xmlns:a="http://schemas.openxmlformats.org/drawingml/2006/main">
+              <a:graphicData uri="http://schemas.openxmlformats.org/drawingml/2006/picture">
+                <pic:pic xmlns:pic="http://schemas.openxmlformats.org/drawingml/2006/picture">
+                  <pic:nvPicPr>
+                    <pic:cNvPr id="365445664" name=""/>
+                    <pic:cNvPicPr/>
+                  </pic:nvPicPr>
+                  <pic:blipFill>
+                    <a:blip r:embed="rId7"/>
+                    <a:stretch>
+                      <a:fillRect/>
+                    </a:stretch>
+                  </pic:blipFill>
+                  <pic:spPr>
+                    <a:xfrm>
+                      <a:off x="0" y="0"/>
+                      <a:ext cx="5612130" cy="2680970"/>
+                    </a:xfrm>
+                    <a:prstGeom prst="rect">
+                      <a:avLst/>
+                    </a:prstGeom>
+                  </pic:spPr>
+                </pic:pic>
+              </a:graphicData>
+            </a:graphic>
+          </wp:inline>
+        </w:drawing>
+      </w:r>
+    </w:p>
+    <w:p>
+      <w:r>
+        <w:drawing>
+          <wp:inline distT="0" distB="0" distL="0" distR="0" wp14:anchorId="20AACBAB" wp14:editId="6292ECB2">
+            <wp:extent cx="5612130" cy="2700020"/>
+            <wp:effectExtent l="0" t="0" r="7620" b="5080"/>
+            <wp:docPr id="1985841055" name="Imagen 1"/>
+            <wp:cNvGraphicFramePr>
+              <a:graphicFrameLocks xmlns:a="http://schemas.openxmlformats.org/drawingml/2006/main" noChangeAspect="1"/>
+            </wp:cNvGraphicFramePr>
+            <a:graphic xmlns:a="http://schemas.openxmlformats.org/drawingml/2006/main">
+              <a:graphicData uri="http://schemas.openxmlformats.org/drawingml/2006/picture">
+                <pic:pic xmlns:pic="http://schemas.openxmlformats.org/drawingml/2006/picture">
+                  <pic:nvPicPr>
+                    <pic:cNvPr id="1985841055" name=""/>
+                    <pic:cNvPicPr/>
+                  </pic:nvPicPr>
+                  <pic:blipFill>
+                    <a:blip r:embed="rId8"/>
+                    <a:stretch>
+                      <a:fillRect/>
+                    </a:stretch>
+                  </pic:blipFill>
+                  <pic:spPr>
+                    <a:xfrm>
+                      <a:off x="0" y="0"/>
+                      <a:ext cx="5612130" cy="2700020"/>
                     </a:xfrm>
                     <a:prstGeom prst="rect">
                       <a:avLst/>

</xml_diff>